<commit_message>
LPS SERS document: own-peak marks on each curve; remove substrate blank from the SERS figure
Co-Authored-By: Claude Sonnet 5.5 <noreply@anthropic.com>
</commit_message>
<xml_diff>
--- a/Final_Submission/08_LPS_SERS_vs_Simulation/LPS_SERS_vs_Simulation_Comparison.docx
+++ b/Final_Submission/08_LPS_SERS_vs_Simulation/LPS_SERS_vs_Simulation_Comparison.docx
@@ -44,7 +44,7 @@
     </w:p>
     <w:p>
       <w:r>
-        <w:t>A reproducible set of ten bands was found in the SERS spectra of LPS on etched silicon (on 21 of 35 LPS spots; absent from the substrate blank). These bands were compared with the calculated Raman spectrum of the whole-molecule lipid A model, and with the bulk LPS reference spectrum. Each of the ten SERS bands has a calculated vibration within 11 cm⁻¹: 9 agree within 10 cm⁻¹ and 1 is shifted by 11 cm⁻¹. The two bands with a published assignment, 1330 cm⁻¹ (C–H deformation) and 1455 cm⁻¹ (CH₂/CH₃ deformation), fall within 1.1 cm⁻¹ of calculated C–H bending vibrations of the expected type.</w:t>
+        <w:t>A reproducible set of ten bands was found in the SERS spectra of LPS on etched silicon (on 21 of 35 LPS spots). These bands were compared with the calculated Raman spectrum of the whole-molecule lipid A model, and with the bulk LPS reference spectrum. Each of the ten SERS bands has a calculated vibration within 11 cm⁻¹: 9 agree within 10 cm⁻¹ and 1 is shifted by 11 cm⁻¹. The two bands with a published assignment, 1330 cm⁻¹ (C–H deformation) and 1455 cm⁻¹ (CH₂/CH₃ deformation), fall within 1.1 cm⁻¹ of calculated C–H bending vibrations of the expected type.</w:t>
       </w:r>
     </w:p>
     <w:p>
@@ -190,7 +190,7 @@
         <w:rPr>
           <w:sz w:val="19"/>
         </w:rPr>
-        <w:t>Mean SERS spectrum of the LPS spots that carry the band set (red, ± 1 standard deviation) and the substrate blank (grey), scaled to the height of the silicon peak. Numbers mark the ten bands.</w:t>
+        <w:t>Mean SERS spectrum of the LPS spots that carry the band set (red line, with ± 1 standard deviation as the shaded band), scaled to the height of the silicon peak. Each number marks a band at its position on the curve.</w:t>
       </w:r>
     </w:p>
     <w:p>
@@ -215,7 +215,7 @@
       <w:r>
         <w:drawing>
           <wp:inline xmlns:a="http://schemas.openxmlformats.org/drawingml/2006/main" xmlns:pic="http://schemas.openxmlformats.org/drawingml/2006/picture">
-            <wp:extent cx="5903999" cy="4807594"/>
+            <wp:extent cx="5903999" cy="5183290"/>
             <wp:docPr id="2" name="Picture 2"/>
             <wp:cNvGraphicFramePr>
               <a:graphicFrameLocks noChangeAspect="1"/>
@@ -236,7 +236,7 @@
                   <pic:spPr>
                     <a:xfrm>
                       <a:off x="0" y="0"/>
-                      <a:ext cx="5903999" cy="4807594"/>
+                      <a:ext cx="5903999" cy="5183290"/>
                     </a:xfrm>
                     <a:prstGeom prst="rect"/>
                   </pic:spPr>
@@ -262,7 +262,7 @@
         <w:rPr>
           <w:sz w:val="19"/>
         </w:rPr>
-        <w:t>Bulk LPS reference (top), SERS mean spectrum (middle) and calculated spectrum of the lipid A model (bottom). Dashed lines join each SERS band to its calculated vibration: green, within 10 cm⁻¹; orange, shifted. Dotted lines in the top panel mark the bulk LPS peaks. Grey bands: silicon peak (middle) and glass zone (top, bottom), which are not compared.</w:t>
+        <w:t>Bulk LPS reference (top), SERS mean spectrum (middle) and calculated spectrum of the lipid A model (bottom). In each panel the dots and numbers mark only the peaks of that curve, at the position where they occur on it: the bulk peaks (top), the SERS bands (middle) and the calculated vibrations that correspond to the SERS bands (bottom). Because each curve is marked separately, a mark and the neighbouring curve may not line up: the same vibration appears at slightly different positions in the three spectra (see the table). Numbers on the curves are read from the plotted curve (the apex of the mean spectrum) and can differ by a few cm⁻¹ from the band positions in the table, which are averages over individual spots. Grey bands: silicon peak (middle) and glass zone (top, bottom), which are not compared.</w:t>
       </w:r>
     </w:p>
     <w:p>

</xml_diff>

<commit_message>
LPS SERS document: compare with visible calculated peaks and mark them on the simulation; agreement is weaker than with weak modes
Co-Authored-By: Claude Sonnet 5.5 <noreply@anthropic.com>
</commit_message>
<xml_diff>
--- a/Final_Submission/08_LPS_SERS_vs_Simulation/LPS_SERS_vs_Simulation_Comparison.docx
+++ b/Final_Submission/08_LPS_SERS_vs_Simulation/LPS_SERS_vs_Simulation_Comparison.docx
@@ -44,12 +44,12 @@
     </w:p>
     <w:p>
       <w:r>
-        <w:t>A reproducible set of ten bands was found in the SERS spectra of LPS on etched silicon (on 21 of 35 LPS spots). These bands were compared with the calculated Raman spectrum of the whole-molecule lipid A model, and with the bulk LPS reference spectrum. Each of the ten SERS bands has a calculated vibration within 11 cm⁻¹: 9 agree within 10 cm⁻¹ and 1 is shifted by 11 cm⁻¹. The two bands with a published assignment, 1330 cm⁻¹ (C–H deformation) and 1455 cm⁻¹ (CH₂/CH₃ deformation), fall within 1.1 cm⁻¹ of calculated C–H bending vibrations of the expected type.</w:t>
+        <w:t>A reproducible set of ten bands was found in the SERS spectra of LPS on etched silicon (on 21 of 35 LPS spots). These bands were compared with the visible peaks of the calculated Raman spectrum of the whole-molecule lipid A model (23 peaks between 400 and 1800 cm⁻¹) and with the bulk LPS reference spectrum. Only 1 of the ten SERS bands has a calculated peak within 10 cm⁻¹ (1330 cm⁻¹, calculated 1338 cm⁻¹). 8 further bands have a calculated peak 11 to 30 cm⁻¹ away, and the band at 1592 cm⁻¹ has no calculated peak within 50 cm⁻¹. In 7 of the 9 matched bands the calculated peak lies at higher wavenumber than the SERS band.</w:t>
       </w:r>
     </w:p>
     <w:p>
       <w:r>
-        <w:t>The agreement cannot be counted as evidence that the bands belong to LPS. The model has 354 vibrations between 400 and 1800 cm⁻¹, so a calculated vibration lies near almost any position: when the calculated positions are displaced by a random 15 to 70 cm⁻¹, 9.6 of the ten bands still fall within 10 cm⁻¹ of a calculated vibration, against 9 for the real positions (p = 0.93). The overall shape also does not match (correlation 0.14 with the calculation and 0.20 with the bulk LPS spectrum). The bulk LPS peaks, including the strongest at 425 cm⁻¹, are absent from the SERS spectra. The SERS pattern is consistent with CH₂ and CH₃ groups of an organic layer on the silicon, with LPS as one possible source; it is not an identification.</w:t>
+        <w:t>The two bands with a published assignment, 1330 cm⁻¹ (C–H deformation) and 1455 cm⁻¹ (CH₂/CH₃ deformation), both have a calculated C–H bending peak of the same type nearby (1338 and 1466 cm⁻¹), so the vibration type agrees while the position is shifted by 8 and 11 cm⁻¹. For the other bands no vibration type is assigned in the literature, so the shifts cannot be judged by type. The agreement is no better than chance: when the calculated peak positions are displaced at random by 15 to 70 cm⁻¹, 3.6 of the ten bands on average fall within 10 cm⁻¹ of a calculated peak, against 1 for the real positions (p = 0.99). The overall shape does not match either (correlation 0.14 with the calculation and 0.20 with the bulk LPS spectrum), and none of the bulk LPS peaks, including the strongest at 425 cm⁻¹, appears in the SERS spectra. The SERS pattern is consistent with CH₂ and CH₃ groups of an organic layer on the silicon, with LPS as one possible source; it is not an identification.</w:t>
       </w:r>
     </w:p>
     <w:p>
@@ -115,7 +115,7 @@
         <w:t xml:space="preserve">Comparison: </w:t>
       </w:r>
       <w:r>
-        <w:t>No spectrum was shifted or rescaled to improve the match; each is scaled to its own maximum, and the silicon region is left out. Each SERS band is matched to the nearest calculated vibration within 50 cm⁻¹ that has appreciable intensity. For bands with a published assignment (1009, 1330 and 1455 cm⁻¹) the calculated vibration must also be of the matching type. For the other seven bands no vibration type is assigned in the literature (two of them, 785 and 1592 cm⁻¹, lie at or near peaks listed as common to commercial endotoxins without an assignment), so the match is by position only. 'Agrees' means a difference of 10 cm⁻¹ or less; 'shifted' means 10 to 50 cm⁻¹.</w:t>
+        <w:t>No spectrum was shifted or rescaled to improve the match; each is scaled to its own maximum, and the silicon region is left out. The calculated peaks are the visible maxima of the broadened calculated spectrum (height above the surrounding curve of at least 0.05 on a 0 to 1 scale), each given the vibration type of its strongest vibration. Each SERS band is matched to the nearest calculated peak within 50 cm⁻¹. For bands with a published assignment (1009, 1330 and 1455 cm⁻¹) the calculated peak must also be of the matching type; for the other seven bands no vibration type is assigned in the literature (two of them, 785 and 1592 cm⁻¹, lie at or near peaks listed as common to commercial endotoxins without an assignment), so the match is by position only. 'Agrees' means a difference of 10 cm⁻¹ or less; 'shifted' means 10 to 50 cm⁻¹.</w:t>
       </w:r>
     </w:p>
     <w:p>
@@ -262,12 +262,12 @@
         <w:rPr>
           <w:sz w:val="19"/>
         </w:rPr>
-        <w:t>Bulk LPS reference (top), SERS mean spectrum (middle) and calculated spectrum of the lipid A model (bottom). In each panel the dots and numbers mark only the peaks of that curve, at the position where they occur on it: the bulk peaks (top), the SERS bands (middle) and the calculated vibrations that correspond to the SERS bands (bottom). Because each curve is marked separately, a mark and the neighbouring curve may not line up: the same vibration appears at slightly different positions in the three spectra (see the table). Numbers on the curves are read from the plotted curve (the apex of the mean spectrum) and can differ by a few cm⁻¹ from the band positions in the table, which are averages over individual spots. Grey bands: silicon peak (middle) and glass zone (top, bottom), which are not compared.</w:t>
+        <w:t>Bulk LPS reference (top), SERS mean spectrum (middle) and calculated spectrum of the lipid A model (bottom). In each panel the dots and numbers mark only the peaks of that curve, at the position where they occur on it: the bulk peaks (top), the SERS bands (middle) and the visible peaks of the calculated spectrum (bottom). The calculated peaks marked are the visible maxima of the calculated spectrum. Numbers on the curves are read from the plotted curve (the apex of the mean spectrum) and can differ by a few cm⁻¹ from the band positions in the table, which are averages over individual spots. Grey bands: silicon peak (middle) and glass zone (top, bottom), which are not compared.</w:t>
       </w:r>
     </w:p>
     <w:p>
       <w:r>
-        <w:t>None of the bulk LPS peaks (425, 766, 861, 996 and 1080 cm⁻¹) appears in the SERS spectrum, although the calculation has vibrations near all of them. Conversely, the strongest SERS bands (1455, 619, 878) correspond to calculated vibrations of moderate intensity, and the strongest calculated peak, near 1516 cm⁻¹, has no strong SERS counterpart (the nearest SERS band is 1536 cm⁻¹).</w:t>
+        <w:t>None of the bulk LPS peaks (425, 766, 862, 996 and 1080 cm⁻¹) appears in the SERS spectrum. The strongest calculated peaks (near 1512, 1314, 993 and 948 cm⁻¹) are not the strongest SERS bands either: the strongest SERS band, 1455 cm⁻¹, falls between calculated peaks at 1414 and 1466 cm⁻¹, and the calculated 1512 cm⁻¹ peak, the strongest in the calculation, has no strong SERS counterpart (the nearest SERS band is 1536 cm⁻¹).</w:t>
       </w:r>
     </w:p>
     <w:p>
@@ -448,7 +448,7 @@
               <w:rPr>
                 <w:sz w:val="18"/>
               </w:rPr>
-              <w:t>614</w:t>
+              <w:t>645</w:t>
             </w:r>
           </w:p>
         </w:tc>
@@ -465,7 +465,7 @@
               <w:rPr>
                 <w:sz w:val="18"/>
               </w:rPr>
-              <w:t>+5</w:t>
+              <w:t>-26</w:t>
             </w:r>
           </w:p>
         </w:tc>
@@ -516,7 +516,7 @@
               <w:rPr>
                 <w:sz w:val="18"/>
               </w:rPr>
-              <w:t>Agrees (type not assigned)</w:t>
+              <w:t>Shifted (type not assigned)</w:t>
             </w:r>
           </w:p>
         </w:tc>
@@ -555,7 +555,7 @@
               <w:rPr>
                 <w:sz w:val="18"/>
               </w:rPr>
-              <w:t>784</w:t>
+              <w:t>806</w:t>
             </w:r>
           </w:p>
         </w:tc>
@@ -572,7 +572,7 @@
               <w:rPr>
                 <w:sz w:val="18"/>
               </w:rPr>
-              <w:t>+1</w:t>
+              <w:t>-21</w:t>
             </w:r>
           </w:p>
         </w:tc>
@@ -623,7 +623,7 @@
               <w:rPr>
                 <w:sz w:val="18"/>
               </w:rPr>
-              <w:t>Agrees (type not assigned)</w:t>
+              <w:t>Shifted (type not assigned)</w:t>
             </w:r>
           </w:p>
         </w:tc>
@@ -662,7 +662,7 @@
               <w:rPr>
                 <w:sz w:val="18"/>
               </w:rPr>
-              <w:t>874</w:t>
+              <w:t>898</w:t>
             </w:r>
           </w:p>
         </w:tc>
@@ -679,7 +679,7 @@
               <w:rPr>
                 <w:sz w:val="18"/>
               </w:rPr>
-              <w:t>+4</w:t>
+              <w:t>-20</w:t>
             </w:r>
           </w:p>
         </w:tc>
@@ -730,7 +730,7 @@
               <w:rPr>
                 <w:sz w:val="18"/>
               </w:rPr>
-              <w:t>Agrees (type not assigned)</w:t>
+              <w:t>Shifted (type not assigned)</w:t>
             </w:r>
           </w:p>
         </w:tc>
@@ -769,7 +769,7 @@
               <w:rPr>
                 <w:sz w:val="18"/>
               </w:rPr>
-              <w:t>1011</w:t>
+              <w:t>1021</w:t>
             </w:r>
           </w:p>
         </w:tc>
@@ -786,7 +786,7 @@
               <w:rPr>
                 <w:sz w:val="18"/>
               </w:rPr>
-              <w:t>-2</w:t>
+              <w:t>-12</w:t>
             </w:r>
           </w:p>
         </w:tc>
@@ -837,7 +837,7 @@
               <w:rPr>
                 <w:sz w:val="18"/>
               </w:rPr>
-              <w:t>Agrees</w:t>
+              <w:t>Shifted</w:t>
             </w:r>
           </w:p>
         </w:tc>
@@ -876,7 +876,7 @@
               <w:rPr>
                 <w:sz w:val="18"/>
               </w:rPr>
-              <w:t>1240</w:t>
+              <w:t>1252</w:t>
             </w:r>
           </w:p>
         </w:tc>
@@ -893,7 +893,7 @@
               <w:rPr>
                 <w:sz w:val="18"/>
               </w:rPr>
-              <w:t>-3</w:t>
+              <w:t>-14</w:t>
             </w:r>
           </w:p>
         </w:tc>
@@ -910,7 +910,7 @@
               <w:rPr>
                 <w:sz w:val="18"/>
               </w:rPr>
-              <w:t>C-H bending / CH2 rocking and twisting</w:t>
+              <w:t>C-O and C-C stretching (backbone)</w:t>
             </w:r>
           </w:p>
         </w:tc>
@@ -944,7 +944,7 @@
               <w:rPr>
                 <w:sz w:val="18"/>
               </w:rPr>
-              <w:t>Agrees (type not assigned)</w:t>
+              <w:t>Shifted (type not assigned)</w:t>
             </w:r>
           </w:p>
         </w:tc>
@@ -983,7 +983,7 @@
               <w:rPr>
                 <w:sz w:val="18"/>
               </w:rPr>
-              <w:t>1329</w:t>
+              <w:t>1338</w:t>
             </w:r>
           </w:p>
         </w:tc>
@@ -1000,7 +1000,7 @@
               <w:rPr>
                 <w:sz w:val="18"/>
               </w:rPr>
-              <w:t>+1</w:t>
+              <w:t>-8</w:t>
             </w:r>
           </w:p>
         </w:tc>
@@ -1090,7 +1090,7 @@
               <w:rPr>
                 <w:sz w:val="18"/>
               </w:rPr>
-              <w:t>1368</w:t>
+              <w:t>1338</w:t>
             </w:r>
           </w:p>
         </w:tc>
@@ -1107,7 +1107,7 @@
               <w:rPr>
                 <w:sz w:val="18"/>
               </w:rPr>
-              <w:t>-0</w:t>
+              <w:t>+30</w:t>
             </w:r>
           </w:p>
         </w:tc>
@@ -1158,7 +1158,7 @@
               <w:rPr>
                 <w:sz w:val="18"/>
               </w:rPr>
-              <w:t>Agrees (type not assigned)</w:t>
+              <w:t>Shifted (type not assigned)</w:t>
             </w:r>
           </w:p>
         </w:tc>
@@ -1197,7 +1197,7 @@
               <w:rPr>
                 <w:sz w:val="18"/>
               </w:rPr>
-              <w:t>1457</w:t>
+              <w:t>1466</w:t>
             </w:r>
           </w:p>
         </w:tc>
@@ -1214,7 +1214,7 @@
               <w:rPr>
                 <w:sz w:val="18"/>
               </w:rPr>
-              <w:t>-1</w:t>
+              <w:t>-11</w:t>
             </w:r>
           </w:p>
         </w:tc>
@@ -1265,7 +1265,7 @@
               <w:rPr>
                 <w:sz w:val="18"/>
               </w:rPr>
-              <w:t>Agrees</w:t>
+              <w:t>Shifted</w:t>
             </w:r>
           </w:p>
         </w:tc>
@@ -1304,7 +1304,7 @@
               <w:rPr>
                 <w:sz w:val="18"/>
               </w:rPr>
-              <w:t>1533</w:t>
+              <w:t>1512</w:t>
             </w:r>
           </w:p>
         </w:tc>
@@ -1321,7 +1321,7 @@
               <w:rPr>
                 <w:sz w:val="18"/>
               </w:rPr>
-              <w:t>+3</w:t>
+              <w:t>+24</w:t>
             </w:r>
           </w:p>
         </w:tc>
@@ -1372,7 +1372,7 @@
               <w:rPr>
                 <w:sz w:val="18"/>
               </w:rPr>
-              <w:t>Agrees (type not assigned)</w:t>
+              <w:t>Shifted (type not assigned)</w:t>
             </w:r>
           </w:p>
         </w:tc>
@@ -1411,7 +1411,7 @@
               <w:rPr>
                 <w:sz w:val="18"/>
               </w:rPr>
-              <w:t>1582</w:t>
+              <w:t>—</w:t>
             </w:r>
           </w:p>
         </w:tc>
@@ -1428,7 +1428,7 @@
               <w:rPr>
                 <w:sz w:val="18"/>
               </w:rPr>
-              <w:t>+11</w:t>
+              <w:t>—</w:t>
             </w:r>
           </w:p>
         </w:tc>
@@ -1445,7 +1445,7 @@
               <w:rPr>
                 <w:sz w:val="18"/>
               </w:rPr>
-              <w:t>N-H bending (ammonium / amide)</w:t>
+              <w:t>—</w:t>
             </w:r>
           </w:p>
         </w:tc>
@@ -1479,7 +1479,7 @@
               <w:rPr>
                 <w:sz w:val="18"/>
               </w:rPr>
-              <w:t>Shifted (type not assigned)</w:t>
+              <w:t>Not reproduced (type not assigned)</w:t>
             </w:r>
           </w:p>
         </w:tc>
@@ -1551,7 +1551,7 @@
     </w:p>
     <w:p>
       <w:r>
-        <w:t>In several windows the calculated spectrum shows only a shoulder or no distinct peak at the matched position (for example at 1329 and 1457 cm⁻¹). The match rests on the position of an individual calculated vibration, not on a visible calculated peak, which is another reason to treat the agreement with caution.</w:t>
+        <w:t>Each close-up shows the SERS band (upper curve) and the nearest calculated peak (lower curve). The calculated peaks are mostly broader and lie to the high-wavenumber side of the SERS band; at 1592 cm⁻¹ there is no calculated peak.</w:t>
       </w:r>
     </w:p>
     <w:p>
@@ -1559,12 +1559,89 @@
         <w:pStyle w:val="Heading2"/>
       </w:pPr>
       <w:r>
-        <w:t>4.4 The shifted band</w:t>
+        <w:t>4.4 Shifted bands: same peak region, different position</w:t>
       </w:r>
     </w:p>
     <w:p>
       <w:r>
-        <w:t>The SERS band at 1592 cm⁻¹ is matched to a calculated vibration at 1582 cm⁻¹ (difference +11 cm⁻¹), which the analysis labels as N–H bending (amide and ammonium-type motion). No vibration type is assigned to this band in the literature, so the correspondence is by position only. A calculated frequency 11 cm⁻¹ lower than the measured one is the size of offset expected from the small basis set and the isolated, gas-phase charged model; on a surface the molecule binds, hydrogen bonds and is oriented, which shifts and re-weights bands. The assignment is therefore tentative.</w:t>
+        <w:t>A SERS band and a calculated peak that are 11 to 30 cm⁻¹ apart are not identical in position. They are treated as possibly the same vibration only where the calculated peak is of the expected type or, for bands with no assigned type, where it is the nearest calculated peak; the following list gives each case:</w:t>
+      </w:r>
+    </w:p>
+    <w:p>
+      <w:pPr>
+        <w:pStyle w:val="ListBullet"/>
+        <w:spacing w:after="60"/>
+      </w:pPr>
+      <w:r>
+        <w:t>SERS 619 cm⁻¹, calculated 645 cm⁻¹ (-26 cm⁻¹), skeletal / ring deformation (position only; the type is not assigned in the experiment).</w:t>
+      </w:r>
+    </w:p>
+    <w:p>
+      <w:pPr>
+        <w:pStyle w:val="ListBullet"/>
+        <w:spacing w:after="60"/>
+      </w:pPr>
+      <w:r>
+        <w:t>SERS 785 cm⁻¹, calculated 806 cm⁻¹ (-21 cm⁻¹), C-O and C-C stretching (backbone) (position only; the type is not assigned in the experiment).</w:t>
+      </w:r>
+    </w:p>
+    <w:p>
+      <w:pPr>
+        <w:pStyle w:val="ListBullet"/>
+        <w:spacing w:after="60"/>
+      </w:pPr>
+      <w:r>
+        <w:t>SERS 878 cm⁻¹, calculated 898 cm⁻¹ (-20 cm⁻¹), C-O and C-C stretching (backbone) (position only; the type is not assigned in the experiment).</w:t>
+      </w:r>
+    </w:p>
+    <w:p>
+      <w:pPr>
+        <w:pStyle w:val="ListBullet"/>
+        <w:spacing w:after="60"/>
+      </w:pPr>
+      <w:r>
+        <w:t>SERS 1009 cm⁻¹, calculated 1021 cm⁻¹ (-12 cm⁻¹), C-O and C-C stretching (backbone) (type matches the published assignment).</w:t>
+      </w:r>
+    </w:p>
+    <w:p>
+      <w:pPr>
+        <w:pStyle w:val="ListBullet"/>
+        <w:spacing w:after="60"/>
+      </w:pPr>
+      <w:r>
+        <w:t>SERS 1238 cm⁻¹, calculated 1252 cm⁻¹ (-14 cm⁻¹), C-O and C-C stretching (backbone) (position only; the type is not assigned in the experiment).</w:t>
+      </w:r>
+    </w:p>
+    <w:p>
+      <w:pPr>
+        <w:pStyle w:val="ListBullet"/>
+        <w:spacing w:after="60"/>
+      </w:pPr>
+      <w:r>
+        <w:t>SERS 1368 cm⁻¹, calculated 1338 cm⁻¹ (+30 cm⁻¹), C-H / O-H bending (CH2, CH3) (position only; the type is not assigned in the experiment). The calculated 1338 cm⁻¹ peak also serves the 1330 cm⁻¹ band, so one calculated peak stands for two SERS bands.</w:t>
+      </w:r>
+    </w:p>
+    <w:p>
+      <w:pPr>
+        <w:pStyle w:val="ListBullet"/>
+        <w:spacing w:after="60"/>
+      </w:pPr>
+      <w:r>
+        <w:t>SERS 1455 cm⁻¹, calculated 1466 cm⁻¹ (-11 cm⁻¹), C-H / O-H bending (CH2, CH3) (type matches the published assignment).</w:t>
+      </w:r>
+    </w:p>
+    <w:p>
+      <w:pPr>
+        <w:pStyle w:val="ListBullet"/>
+        <w:spacing w:after="60"/>
+      </w:pPr>
+      <w:r>
+        <w:t>SERS 1536 cm⁻¹, calculated 1512 cm⁻¹ (+24 cm⁻¹), C-H / O-H bending (CH2, CH3) (position only; the type is not assigned in the experiment).</w:t>
+      </w:r>
+    </w:p>
+    <w:p>
+      <w:r>
+        <w:t>Likely reasons for the offsets (not separately tested): the calculation is for an isolated molecule with a small basis set, and the single frequency scale factor (0.965) was not fitted for that level, so a systematic offset of 10 to 25 cm⁻¹ is expected; on the silicon surface the molecule binds, hydrogen bonds and takes a preferred orientation, which shifts bands and changes which are enhanced; and the calculated spectrum comes from a shortened lipid A, not the whole LPS. The shifts are mostly in one direction (the calculated peak is higher), which points to the method rather than to different vibrations, but this does not make the assignment secure.</w:t>
       </w:r>
     </w:p>
     <w:p>
@@ -1631,7 +1708,7 @@
         <w:rPr>
           <w:sz w:val="19"/>
         </w:rPr>
-        <w:t>Atoms that move most in the calculated vibrations that correspond to the SERS bands. Each colour is one vibration (key at right); hydrogen atoms are assigned to the atom they are bonded to. The vibrations are spread over several groups rather than one bond.</w:t>
+        <w:t>Atoms that move most in the strongest vibration of each calculated peak that was matched to a SERS band. Each colour is one vibration (key at right); hydrogen atoms are assigned to the atom they are bonded to. The vibrations are spread over several groups rather than one bond.</w:t>
       </w:r>
     </w:p>
     <w:p>
@@ -1648,7 +1725,7 @@
         <w:spacing w:after="60"/>
       </w:pPr>
       <w:r>
-        <w:t>Positions: all ten SERS bands lie within 11 cm⁻¹ of a calculated vibration of the lipid A model, and the two bands with a published assignment, 1330 and 1455 cm⁻¹, match calculated C–H bending vibrations within about 1 cm⁻¹. This is consistent with CH₂/CH₃ and C–H groups, which are present in LPS (acyl chains and sugars) and in many other organic layers.</w:t>
+        <w:t>Positions: compared with the visible peaks of the calculation, only the 1330 cm⁻¹ band is within 10 cm⁻¹ of a calculated peak (1338 cm⁻¹); the others are shifted by 11 to 30 cm⁻¹ or, for 1592 cm⁻¹, have no calculated peak. Weak individual calculated vibrations lie closer to several SERS bands, but they do not form visible peaks and would be a misleading basis for a match.</w:t>
       </w:r>
     </w:p>
     <w:p>
@@ -1657,7 +1734,16 @@
         <w:spacing w:after="60"/>
       </w:pPr>
       <w:r>
-        <w:t>Chance: because the model has many vibrations, the same level of agreement is reached for randomly displaced positions about nine times in ten (p = 0.93). The position agreement is therefore not evidence that the bands belong to LPS.</w:t>
+        <w:t>Chance: with 23 calculated peaks over 1400 cm⁻¹, 3.6 of the ten bands fall within 10 cm⁻¹ of a calculated peak on average when positions are displaced at random, against 1 for the real positions (p = 0.99). The agreement in position is therefore not evidence that the bands belong to LPS.</w:t>
+      </w:r>
+    </w:p>
+    <w:p>
+      <w:pPr>
+        <w:pStyle w:val="ListBullet"/>
+        <w:spacing w:after="60"/>
+      </w:pPr>
+      <w:r>
+        <w:t>Vibration type: the two bands with a published assignment, 1330 cm⁻¹ and 1455 cm⁻¹, have a calculated C–H bending peak of the same type nearby (1338 and 1466 cm⁻¹). This is consistent with CH₂/CH₃ and C–H groups, which occur in LPS (fatty-acid chains and sugars) and in many other organic layers.</w:t>
       </w:r>
     </w:p>
     <w:p>
@@ -1688,7 +1774,7 @@
     </w:p>
     <w:p>
       <w:r>
-        <w:t>The SERS bands of the LPS spots are consistent with the vibration types predicted by the lipid A model, but this agreement is not stronger than chance and the overall spectra do not match, so the bands are not yet attributed to LPS. The most useful next steps are to repeat the LPS measurement on a fresh substrate with a solvent-only control prepared in the same way and a blank at the start and end of the set, and to measure bulk LPS on the same type of silicon to see directly which bands LPS gives there. On the calculation side, a larger basis set with water and counter-ions, and a model that includes the sugar-bound surface orientation, would test whether the bands near 619, 878 and 1238 cm⁻¹ can be assigned.</w:t>
+        <w:t>The SERS bands of the LPS spots match the calculated lipid A spectrum only loosely: one band lies within 10 cm⁻¹ of a calculated peak, the others are shifted by 11 to 30 cm⁻¹ or have no counterpart, and the agreement is not stronger than chance. The vibration type agrees for the two bands that have a published assignment. The bands are therefore not attributed to LPS. The most useful next steps are to repeat the LPS measurement on a fresh substrate with a solvent-only control prepared in the same way and a blank at the start and end of the set, and to measure bulk LPS on the same type of silicon to see which bands LPS gives there. On the calculation side, a larger basis set with water and counter-ions would test whether the offsets of 10 to 25 cm⁻¹ come from the method, and a model with the molecule bound to a surface would test the enhancement pattern.</w:t>
       </w:r>
     </w:p>
     <w:sectPr>

</xml_diff>